<commit_message>
Update Mathura agreement template - revised version
</commit_message>
<xml_diff>
--- a/templates/mathura.docx
+++ b/templates/mathura.docx
@@ -430,12 +430,12 @@
               <wp:inline distB="0" distT="0" distL="0" distR="0">
                 <wp:extent cx="6182995" cy="571500"/>
                 <wp:effectExtent b="0" l="0" r="0" t="0"/>
-                <wp:docPr id="1" name="image3.png"/>
+                <wp:docPr id="1" name="image1.png"/>
                 <a:graphic>
                   <a:graphicData uri="http://schemas.openxmlformats.org/drawingml/2006/picture">
                     <pic:pic>
                       <pic:nvPicPr>
-                        <pic:cNvPr id="0" name="image3.png"/>
+                        <pic:cNvPr id="0" name="image1.png"/>
                         <pic:cNvPicPr preferRelativeResize="0"/>
                       </pic:nvPicPr>
                       <pic:blipFill>
@@ -671,12 +671,12 @@
                 <wp:extent cx="5822695" cy="788415"/>
                 <wp:effectExtent b="0" l="0" r="0" t="0"/>
                 <wp:wrapTopAndBottom distB="0" distT="0"/>
-                <wp:docPr id="2" name="image4.png"/>
+                <wp:docPr id="2" name="image2.png"/>
                 <a:graphic>
                   <a:graphicData uri="http://schemas.openxmlformats.org/drawingml/2006/picture">
                     <pic:pic>
                       <pic:nvPicPr>
-                        <pic:cNvPr id="0" name="image4.png"/>
+                        <pic:cNvPr id="0" name="image2.png"/>
                         <pic:cNvPicPr preferRelativeResize="0"/>
                       </pic:nvPicPr>
                       <pic:blipFill>
@@ -737,12 +737,12 @@
             <wp:extent cx="6677025" cy="5448300"/>
             <wp:effectExtent b="0" l="0" r="0" t="0"/>
             <wp:wrapNone/>
-            <wp:docPr id="4" name="image2.jpg"/>
+            <wp:docPr id="4" name="image3.jpg"/>
             <a:graphic>
               <a:graphicData uri="http://schemas.openxmlformats.org/drawingml/2006/picture">
                 <pic:pic>
                   <pic:nvPicPr>
-                    <pic:cNvPr id="0" name="image2.jpg"/>
+                    <pic:cNvPr id="0" name="image3.jpg"/>
                     <pic:cNvPicPr preferRelativeResize="0"/>
                   </pic:nvPicPr>
                   <pic:blipFill>
@@ -846,7 +846,7 @@
           <w:szCs w:val="24"/>
           <w:rtl w:val="0"/>
         </w:rPr>
-        <w:t xml:space="preserve">                  CUSTOMER ID NUMBER –CBMWTF/{city_code}/BMWDA-{facility_code}</w:t>
+        <w:t xml:space="preserve">                          CUSTOMER ID NUMBER –CBMWTF/{city_code}/BMWDA-{facility_code}</w:t>
       </w:r>
       <w:r>
         <w:rPr>
@@ -925,61 +925,6 @@
         <w:ind w:left="0" w:right="1130" w:firstLine="0"/>
         <w:jc w:val="left"/>
         <w:rPr>
-          <w:sz w:val="24"/>
-          <w:szCs w:val="24"/>
-        </w:rPr>
-      </w:pPr>
-      <w:r>
-        <w:rPr>
-          <w:sz w:val="24"/>
-          <w:szCs w:val="24"/>
-          <w:rtl w:val="0"/>
-        </w:rPr>
-        <w:t xml:space="preserve">                This Agreement is entered into on this </w:t>
-      </w:r>
-      <w:r>
-        <w:rPr>
-          <w:b w:val="1"/>
-          <w:bCs w:val="1"/>
-          <w:sz w:val="24"/>
-          <w:szCs w:val="24"/>
-          <w:rtl w:val="0"/>
-        </w:rPr>
-        <w:t xml:space="preserve">{date} </w:t>
-      </w:r>
-      <w:r>
-        <w:rPr>
-          <w:sz w:val="24"/>
-          <w:szCs w:val="24"/>
-          <w:rtl w:val="0"/>
-        </w:rPr>
-        <w:t xml:space="preserve">Day </w:t>
-      </w:r>
-      <w:r>
-        <w:rPr>
-          <w:b w:val="1"/>
-          <w:bCs w:val="1"/>
-          <w:sz w:val="24"/>
-          <w:szCs w:val="24"/>
-          <w:rtl w:val="0"/>
-        </w:rPr>
-        <w:t xml:space="preserve">{month_name}-{year}</w:t>
-      </w:r>
-      <w:r>
-        <w:rPr>
-          <w:sz w:val="24"/>
-          <w:szCs w:val="24"/>
-          <w:rtl w:val="0"/>
-        </w:rPr>
-        <w:t xml:space="preserve"> at </w:t>
-      </w:r>
-    </w:p>
-    <w:p>
-      <w:pPr>
-        <w:spacing w:before="0" w:line="482" w:lineRule="auto"/>
-        <w:ind w:left="0" w:right="1130" w:firstLine="0"/>
-        <w:jc w:val="left"/>
-        <w:rPr>
           <w:b w:val="1"/>
           <w:bCs w:val="1"/>
           <w:sz w:val="23"/>
@@ -988,13 +933,57 @@
       </w:pPr>
       <w:r>
         <w:rPr>
-          <w:b w:val="1"/>
-          <w:bCs w:val="1"/>
-          <w:sz w:val="24"/>
-          <w:szCs w:val="24"/>
-          <w:rtl w:val="0"/>
-        </w:rPr>
-        <w:t xml:space="preserve">                                                                         MATHURA</w:t>
+          <w:sz w:val="24"/>
+          <w:szCs w:val="24"/>
+          <w:rtl w:val="0"/>
+        </w:rPr>
+        <w:t xml:space="preserve">                This Agreement is entered into on this </w:t>
+      </w:r>
+      <w:r>
+        <w:rPr>
+          <w:b w:val="1"/>
+          <w:bCs w:val="1"/>
+          <w:sz w:val="24"/>
+          <w:szCs w:val="24"/>
+          <w:rtl w:val="0"/>
+        </w:rPr>
+        <w:t xml:space="preserve">{date} </w:t>
+      </w:r>
+      <w:r>
+        <w:rPr>
+          <w:sz w:val="24"/>
+          <w:szCs w:val="24"/>
+          <w:rtl w:val="0"/>
+        </w:rPr>
+        <w:t xml:space="preserve">Day </w:t>
+      </w:r>
+      <w:r>
+        <w:rPr>
+          <w:b w:val="1"/>
+          <w:bCs w:val="1"/>
+          <w:sz w:val="24"/>
+          <w:szCs w:val="24"/>
+          <w:rtl w:val="0"/>
+        </w:rPr>
+        <w:t xml:space="preserve">{month_name}-{year}</w:t>
+      </w:r>
+      <w:r>
+        <w:rPr>
+          <w:sz w:val="24"/>
+          <w:szCs w:val="24"/>
+          <w:rtl w:val="0"/>
+        </w:rPr>
+        <w:t xml:space="preserve"> at </w:t>
+      </w:r>
+      <w:r>
+        <w:rPr>
+          <w:b w:val="1"/>
+          <w:bCs w:val="1"/>
+          <w:sz w:val="24"/>
+          <w:szCs w:val="24"/>
+          <w:rtl w:val="0"/>
+        </w:rPr>
+        <w:t xml:space="preserve">MATHURA</w:t>
       </w:r>
       <w:r>
         <w:rPr>
@@ -2017,12 +2006,12 @@
             <wp:extent cx="5783580" cy="5452871"/>
             <wp:effectExtent b="0" l="0" r="0" t="0"/>
             <wp:wrapNone/>
-            <wp:docPr id="5" name="image1.jpg"/>
+            <wp:docPr id="5" name="image4.jpg"/>
             <a:graphic>
               <a:graphicData uri="http://schemas.openxmlformats.org/drawingml/2006/picture">
                 <pic:pic>
                   <pic:nvPicPr>
-                    <pic:cNvPr id="0" name="image1.jpg"/>
+                    <pic:cNvPr id="0" name="image4.jpg"/>
                     <pic:cNvPicPr preferRelativeResize="0"/>
                   </pic:nvPicPr>
                   <pic:blipFill>
@@ -2350,42 +2339,7 @@
           <w:szCs w:val="24"/>
           <w:rtl w:val="0"/>
         </w:rPr>
-        <w:t xml:space="preserve">……and</w:t>
-      </w:r>
-    </w:p>
-    <w:p>
-      <w:pPr>
-        <w:keepNext w:val="0"/>
-        <w:keepLines w:val="0"/>
-        <w:pageBreakBefore w:val="0"/>
-        <w:widowControl w:val="0"/>
-        <w:pBdr>
-          <w:top w:space="0" w:sz="0" w:val="nil"/>
-          <w:left w:space="0" w:sz="0" w:val="nil"/>
-          <w:bottom w:space="0" w:sz="0" w:val="nil"/>
-          <w:right w:space="0" w:sz="0" w:val="nil"/>
-          <w:between w:space="0" w:sz="0" w:val="nil"/>
-        </w:pBdr>
-        <w:shd w:fill="auto" w:val="clear"/>
-        <w:tabs>
-          <w:tab w:val="left" w:leader="none" w:pos="1252"/>
-          <w:tab w:val="left" w:leader="none" w:pos="7628"/>
-        </w:tabs>
-        <w:spacing w:after="0" w:before="0" w:line="240" w:lineRule="auto"/>
-        <w:ind w:left="554" w:right="0" w:firstLine="0"/>
-        <w:jc w:val="both"/>
-        <w:rPr>
-          <w:sz w:val="22"/>
-          <w:szCs w:val="22"/>
-        </w:rPr>
-      </w:pPr>
-      <w:r>
-        <w:rPr>
-          <w:sz w:val="24"/>
-          <w:szCs w:val="24"/>
-          <w:rtl w:val="0"/>
-        </w:rPr>
-        <w:t xml:space="preserve">actual bed…</w:t>
+        <w:t xml:space="preserve">……and actual bed…</w:t>
       </w:r>
       <w:r>
         <w:rPr>
@@ -4325,7 +4279,7 @@
         <w:rPr>
           <w:rtl w:val="0"/>
         </w:rPr>
-        <w:t xml:space="preserve">               WASTE GENERATOR</w:t>
+        <w:t xml:space="preserve"> WASTE GENERATOR</w:t>
         <w:tab/>
         <w:t xml:space="preserve">    CBMWTF OPERATOR</w:t>
       </w:r>

</xml_diff>